<commit_message>
update till 25.07.26 first run
</commit_message>
<xml_diff>
--- a/notes_furbished/SheetMetalSection.docx
+++ b/notes_furbished/SheetMetalSection.docx
@@ -14,7 +14,15 @@
     <w:p/>
     <w:p>
       <w:r>
-        <w:t>In Charge: Mr. Hanjala SSAE (M)</w:t>
+        <w:t xml:space="preserve">In Charge: Mr. </w:t>
+      </w:r>
+      <w:proofErr w:type="spellStart"/>
+      <w:r>
+        <w:t>Hanjala</w:t>
+      </w:r>
+      <w:proofErr w:type="spellEnd"/>
+      <w:r>
+        <w:t xml:space="preserve"> SSAE (M)</w:t>
       </w:r>
     </w:p>
     <w:p>
@@ -29,7 +37,10 @@
     <w:p/>
     <w:p>
       <w:r>
-        <w:t>What the section does:</w:t>
+        <w:t>What the section does</w:t>
+      </w:r>
+      <w:r>
+        <w:t xml:space="preserve"> is repairing and replacing of these following major components of locomotives:</w:t>
       </w:r>
     </w:p>
     <w:p>
@@ -89,18 +100,47 @@
     <w:p/>
     <w:p>
       <w:r>
-        <w:t>Arc welding is used for build up process</w:t>
-      </w:r>
-    </w:p>
-    <w:p/>
-    <w:p>
-      <w:r>
-        <w:t>CaO is used for cooling of built up axle motor.</w:t>
-      </w:r>
-    </w:p>
-    <w:p>
-      <w:r>
-        <w:t>(because if water used -&gt; cracks... if naturally cooeld -&gt; hardness so high that boring machines cannot bore it to standard size)</w:t>
+        <w:t xml:space="preserve">Arc welding is used for </w:t>
+      </w:r>
+      <w:proofErr w:type="spellStart"/>
+      <w:proofErr w:type="gramStart"/>
+      <w:r>
+        <w:t>build</w:t>
+      </w:r>
+      <w:proofErr w:type="gramEnd"/>
+      <w:r>
+        <w:t xml:space="preserve"> up</w:t>
+      </w:r>
+      <w:proofErr w:type="spellEnd"/>
+      <w:r>
+        <w:t xml:space="preserve"> process</w:t>
+      </w:r>
+    </w:p>
+    <w:p/>
+    <w:p>
+      <w:r>
+        <w:t xml:space="preserve">CaO is used for cooling of </w:t>
+      </w:r>
+      <w:proofErr w:type="gramStart"/>
+      <w:r>
+        <w:t>built up</w:t>
+      </w:r>
+      <w:proofErr w:type="gramEnd"/>
+      <w:r>
+        <w:t xml:space="preserve"> axle motor.</w:t>
+      </w:r>
+    </w:p>
+    <w:p>
+      <w:r>
+        <w:t xml:space="preserve">(because if water used -&gt; cracks... if naturally </w:t>
+      </w:r>
+      <w:proofErr w:type="spellStart"/>
+      <w:r>
+        <w:t>cooeld</w:t>
+      </w:r>
+      <w:proofErr w:type="spellEnd"/>
+      <w:r>
+        <w:t xml:space="preserve"> -&gt; hardness so high that boring machines cannot bore it to standard size)</w:t>
       </w:r>
     </w:p>
     <w:p/>
@@ -122,21 +162,44 @@
     <w:p/>
     <w:p>
       <w:r>
-        <w:t>![alt text](</w:t>
-      </w:r>
-      <w:r>
-        <w:rPr>
-          <w:u w:val="single"/>
-        </w:rPr>
-        <w:t>image.png</w:t>
-      </w:r>
-      <w:r>
-        <w:t>)</w:t>
-      </w:r>
-    </w:p>
-    <w:p>
-      <w:r>
         <w:lastRenderedPageBreak/>
+        <w:drawing>
+          <wp:inline distT="0" distB="0" distL="0" distR="0" wp14:anchorId="2F3C3080" wp14:editId="5C7B00E8">
+            <wp:extent cx="5731510" cy="2812415"/>
+            <wp:effectExtent l="0" t="0" r="2540" b="6985"/>
+            <wp:docPr id="1113452538" name="Picture 1"/>
+            <wp:cNvGraphicFramePr>
+              <a:graphicFrameLocks xmlns:a="http://schemas.openxmlformats.org/drawingml/2006/main" noChangeAspect="1"/>
+            </wp:cNvGraphicFramePr>
+            <a:graphic xmlns:a="http://schemas.openxmlformats.org/drawingml/2006/main">
+              <a:graphicData uri="http://schemas.openxmlformats.org/drawingml/2006/picture">
+                <pic:pic xmlns:pic="http://schemas.openxmlformats.org/drawingml/2006/picture">
+                  <pic:nvPicPr>
+                    <pic:cNvPr id="1113452538" name=""/>
+                    <pic:cNvPicPr/>
+                  </pic:nvPicPr>
+                  <pic:blipFill>
+                    <a:blip r:embed="rId5"/>
+                    <a:stretch>
+                      <a:fillRect/>
+                    </a:stretch>
+                  </pic:blipFill>
+                  <pic:spPr>
+                    <a:xfrm>
+                      <a:off x="0" y="0"/>
+                      <a:ext cx="5731510" cy="2812415"/>
+                    </a:xfrm>
+                    <a:prstGeom prst="rect">
+                      <a:avLst/>
+                    </a:prstGeom>
+                  </pic:spPr>
+                </pic:pic>
+              </a:graphicData>
+            </a:graphic>
+          </wp:inline>
+        </w:drawing>
+      </w:r>
+      <w:r>
         <w:t>after separating the core, 24hrs dipped inside a mix of water, sodium triphosphate, soda, soft soap.</w:t>
       </w:r>
     </w:p>
@@ -229,7 +292,34 @@
     </w:p>
     <w:p>
       <w:r>
-        <w:t>26,27,29</w:t>
+        <w:t>26</w:t>
+      </w:r>
+      <w:r>
+        <w:t>00</w:t>
+      </w:r>
+      <w:r>
+        <w:t>,</w:t>
+      </w:r>
+      <w:r>
+        <w:t xml:space="preserve"> </w:t>
+      </w:r>
+      <w:r>
+        <w:t>27</w:t>
+      </w:r>
+      <w:r>
+        <w:t>00</w:t>
+      </w:r>
+      <w:r>
+        <w:t>,</w:t>
+      </w:r>
+      <w:r>
+        <w:t xml:space="preserve"> </w:t>
+      </w:r>
+      <w:r>
+        <w:t>29</w:t>
+      </w:r>
+      <w:r>
+        <w:t>00</w:t>
       </w:r>
     </w:p>
     <w:p>
@@ -239,7 +329,22 @@
     </w:p>
     <w:p>
       <w:r>
-        <w:t>64,65</w:t>
+        <w:t>64</w:t>
+      </w:r>
+      <w:r>
+        <w:t>00</w:t>
+      </w:r>
+      <w:r>
+        <w:t>,</w:t>
+      </w:r>
+      <w:r>
+        <w:t xml:space="preserve"> </w:t>
+      </w:r>
+      <w:r>
+        <w:t>65</w:t>
+      </w:r>
+      <w:r>
+        <w:t>00</w:t>
       </w:r>
     </w:p>
     <w:p/>
@@ -260,20 +365,41 @@
     </w:p>
     <w:p/>
     <w:p>
-      <w:r>
-        <w:t>basically cleaning and leakage test of water tank are the only two task done at this section.</w:t>
-      </w:r>
-    </w:p>
-    <w:p/>
-    <w:p>
-      <w:r>
-        <w:t>leakage thakle leak proof korte hobe (by welding or something)</w:t>
-      </w:r>
-    </w:p>
-    <w:p/>
-    <w:p>
-      <w:r>
-        <w:t>water er moddhe deoa hoy Nalco.</w:t>
+      <w:proofErr w:type="gramStart"/>
+      <w:r>
+        <w:t>basically</w:t>
+      </w:r>
+      <w:proofErr w:type="gramEnd"/>
+      <w:r>
+        <w:t xml:space="preserve"> cleaning and leakage test of water tank are the only two </w:t>
+      </w:r>
+      <w:proofErr w:type="gramStart"/>
+      <w:r>
+        <w:t>task</w:t>
+      </w:r>
+      <w:proofErr w:type="gramEnd"/>
+      <w:r>
+        <w:t xml:space="preserve"> done at this section.</w:t>
+      </w:r>
+    </w:p>
+    <w:p/>
+    <w:p>
+      <w:r>
+        <w:t xml:space="preserve">If there is any leakage detected, </w:t>
+      </w:r>
+      <w:proofErr w:type="gramStart"/>
+      <w:r>
+        <w:t>have to</w:t>
+      </w:r>
+      <w:proofErr w:type="gramEnd"/>
+      <w:r>
+        <w:t xml:space="preserve"> weld or do anything to make it leakproof</w:t>
+      </w:r>
+    </w:p>
+    <w:p/>
+    <w:p>
+      <w:r>
+        <w:t>For cleaning purpose Nalco (a type of cleaning agent) is mixed in the water.</w:t>
       </w:r>
     </w:p>
     <w:p>
@@ -296,7 +422,7 @@
     <w:p/>
     <w:p>
       <w:r>
-        <w:t>compressor je air toiri kore eita ekhane joma hoy.</w:t>
+        <w:t>Compressed air produced by the compressor is stored here.</w:t>
       </w:r>
     </w:p>
     <w:p/>
@@ -304,11 +430,24 @@
       <w:r>
         <w:t>cleaning and leakage test</w:t>
       </w:r>
-    </w:p>
-    <w:p/>
-    <w:p>
-      <w:r>
-        <w:t>braking, horn, window wiper er jonno compressed air lage eita ekhane lage</w:t>
+      <w:r>
+        <w:t xml:space="preserve"> are done</w:t>
+      </w:r>
+    </w:p>
+    <w:p/>
+    <w:p>
+      <w:r>
+        <w:lastRenderedPageBreak/>
+        <w:t xml:space="preserve">compressed air is required in the locomotive for </w:t>
+      </w:r>
+      <w:r>
+        <w:t>braking, horn,</w:t>
+      </w:r>
+      <w:r>
+        <w:t xml:space="preserve"> functioning of the </w:t>
+      </w:r>
+      <w:r>
+        <w:t>window wiper</w:t>
       </w:r>
     </w:p>
     <w:p>
@@ -328,24 +467,34 @@
     <w:p/>
     <w:p>
       <w:r>
-        <w:t>onekgula palla thake</w:t>
-      </w:r>
-    </w:p>
-    <w:p>
-      <w:r>
-        <w:t>ekta certain structure thake, need to maintain</w:t>
-      </w:r>
-    </w:p>
-    <w:p/>
-    <w:p>
-      <w:r>
-        <w:t>kichu baka hole hydraulic press machine use kora hoy</w:t>
-      </w:r>
-    </w:p>
-    <w:p/>
-    <w:p>
-      <w:r>
-        <w:t>hammering etc to hoy e.</w:t>
+        <w:t>Hood of the locomotive has door leaves and window sashes</w:t>
+      </w:r>
+    </w:p>
+    <w:p>
+      <w:r>
+        <w:t xml:space="preserve">Those, and </w:t>
+      </w:r>
+      <w:proofErr w:type="gramStart"/>
+      <w:r>
+        <w:t>overall</w:t>
+      </w:r>
+      <w:proofErr w:type="gramEnd"/>
+      <w:r>
+        <w:t xml:space="preserve"> everything in the hood has certain standard measurements for every class of locomotive, these standard measurements </w:t>
+      </w:r>
+      <w:proofErr w:type="gramStart"/>
+      <w:r>
+        <w:t>have to</w:t>
+      </w:r>
+      <w:proofErr w:type="gramEnd"/>
+      <w:r>
+        <w:t xml:space="preserve"> be maintained.</w:t>
+      </w:r>
+    </w:p>
+    <w:p/>
+    <w:p>
+      <w:r>
+        <w:t>If any part of the metal superstructure is bent as such that normal hammering process cannot fix it, we use hydraulic press machines.</w:t>
       </w:r>
     </w:p>
     <w:p>
@@ -367,19 +516,51 @@
     </w:p>
     <w:p>
       <w:r>
-        <w:t>most important</w:t>
-      </w:r>
-    </w:p>
-    <w:p/>
-    <w:p>
-      <w:r>
-        <w:t>doroja change, janala change, hand rail change</w:t>
-      </w:r>
-    </w:p>
-    <w:p/>
-    <w:p>
-      <w:r>
-        <w:t>buffer, padestal, engine bed, compressor bed, alternator bed</w:t>
+        <w:t xml:space="preserve">most </w:t>
+      </w:r>
+      <w:r>
+        <w:t xml:space="preserve">frequent </w:t>
+      </w:r>
+      <w:r>
+        <w:t>work done in this section.</w:t>
+      </w:r>
+    </w:p>
+    <w:p/>
+    <w:p>
+      <w:r>
+        <w:t xml:space="preserve">Doors </w:t>
+      </w:r>
+      <w:r>
+        <w:t xml:space="preserve">change, </w:t>
+      </w:r>
+      <w:r>
+        <w:t xml:space="preserve">windows </w:t>
+      </w:r>
+      <w:r>
+        <w:t xml:space="preserve">change, </w:t>
+      </w:r>
+      <w:proofErr w:type="gramStart"/>
+      <w:r>
+        <w:t>hand rail</w:t>
+      </w:r>
+      <w:proofErr w:type="gramEnd"/>
+      <w:r>
+        <w:t xml:space="preserve"> change</w:t>
+      </w:r>
+    </w:p>
+    <w:p/>
+    <w:p>
+      <w:r>
+        <w:t xml:space="preserve">buffer, </w:t>
+      </w:r>
+      <w:r>
+        <w:t>pedestal</w:t>
+      </w:r>
+      <w:r>
+        <w:t>, engine bed, compressor bed, alternator bed</w:t>
+      </w:r>
+      <w:r>
+        <w:t xml:space="preserve"> standard measurements are maintained.</w:t>
       </w:r>
     </w:p>
     <w:p/>
@@ -394,37 +575,100 @@
     </w:p>
     <w:p>
       <w:r>
-        <w:t>koyek dhap e rong kora</w:t>
-      </w:r>
-    </w:p>
-    <w:p/>
-    <w:p>
-      <w:r>
-        <w:t>first entry r pore shirish kagoj diye tule zinc chromate paint kora hoy</w:t>
-      </w:r>
-    </w:p>
-    <w:p/>
-    <w:p>
-      <w:r>
-        <w:t>second: pudding mara hoy, ghoshe tule color deoa hoy (primer)... shesh e ekta foundation color mara hoy</w:t>
-      </w:r>
-    </w:p>
-    <w:p/>
-    <w:p>
-      <w:r>
-        <w:t>third: spray korbo after trial run, just before handover</w:t>
-      </w:r>
-    </w:p>
-    <w:p/>
-    <w:p>
-      <w:r>
-        <w:t>Sand Blast plant ache... but eita ekhon chalano jacche na, because of manpower shortage.</w:t>
-      </w:r>
-    </w:p>
-    <w:p/>
-    <w:p>
-      <w:r>
-        <w:t>rong er kichu nam:</w:t>
+        <w:t>Three stage process.</w:t>
+      </w:r>
+    </w:p>
+    <w:p/>
+    <w:p>
+      <w:r>
+        <w:t>First stage:</w:t>
+      </w:r>
+    </w:p>
+    <w:p>
+      <w:r>
+        <w:t>after entering the section, sandpaper is used to strip the paint off.</w:t>
+      </w:r>
+    </w:p>
+    <w:p>
+      <w:r>
+        <w:t>Then zinc chromate paint is applied to the body (the most basic foundational colour of the locomotive)</w:t>
+      </w:r>
+    </w:p>
+    <w:p/>
+    <w:p>
+      <w:r>
+        <w:t>Second stage:</w:t>
+      </w:r>
+    </w:p>
+    <w:p>
+      <w:pPr>
+        <w:pStyle w:val="ListParagraph"/>
+        <w:numPr>
+          <w:ilvl w:val="0"/>
+          <w:numId w:val="1"/>
+        </w:numPr>
+      </w:pPr>
+      <w:r>
+        <w:t>dent is filled with putty</w:t>
+      </w:r>
+    </w:p>
+    <w:p>
+      <w:pPr>
+        <w:pStyle w:val="ListParagraph"/>
+        <w:numPr>
+          <w:ilvl w:val="0"/>
+          <w:numId w:val="1"/>
+        </w:numPr>
+      </w:pPr>
+      <w:r>
+        <w:t>primer colour applied</w:t>
+      </w:r>
+    </w:p>
+    <w:p>
+      <w:pPr>
+        <w:pStyle w:val="ListParagraph"/>
+        <w:numPr>
+          <w:ilvl w:val="0"/>
+          <w:numId w:val="1"/>
+        </w:numPr>
+      </w:pPr>
+      <w:r>
+        <w:t>then a foundation colour</w:t>
+      </w:r>
+      <w:r>
+        <w:t xml:space="preserve"> applied also</w:t>
+      </w:r>
+    </w:p>
+    <w:p/>
+    <w:p>
+      <w:r>
+        <w:t>third stage:</w:t>
+      </w:r>
+    </w:p>
+    <w:p>
+      <w:r>
+        <w:t>after trial run, spray paint all over the locomotive, just before handover</w:t>
+      </w:r>
+    </w:p>
+    <w:p/>
+    <w:p>
+      <w:r>
+        <w:t xml:space="preserve">we do have a </w:t>
+      </w:r>
+      <w:r>
+        <w:t xml:space="preserve">Sand Blast plant... but </w:t>
+      </w:r>
+      <w:r>
+        <w:t>because of manpower shortage, cannot be run</w:t>
+      </w:r>
+      <w:r>
+        <w:t>.</w:t>
+      </w:r>
+    </w:p>
+    <w:p/>
+    <w:p>
+      <w:r>
+        <w:t>Some names of paints:</w:t>
       </w:r>
     </w:p>
     <w:p>
@@ -444,7 +688,6 @@
     </w:p>
     <w:p>
       <w:r>
-        <w:lastRenderedPageBreak/>
         <w:t>4. black finishing</w:t>
       </w:r>
     </w:p>
@@ -455,7 +698,10 @@
     </w:p>
     <w:p>
       <w:r>
-        <w:t>6. aluminilium</w:t>
+        <w:t xml:space="preserve">6. </w:t>
+      </w:r>
+      <w:r>
+        <w:t>aluminium</w:t>
       </w:r>
     </w:p>
     <w:p>
@@ -468,17 +714,27 @@
     </w:p>
     <w:p>
       <w:r>
-        <w:t>manpower:</w:t>
-      </w:r>
-    </w:p>
-    <w:p>
-      <w:r>
-        <w:t>60% to 70% manpower ghatti.</w:t>
-      </w:r>
-    </w:p>
-    <w:p>
-      <w:r>
-        <w:t>material issue.</w:t>
+        <w:t xml:space="preserve">60% to 70% manpower </w:t>
+      </w:r>
+      <w:r>
+        <w:t>deficiency</w:t>
+      </w:r>
+      <w:r>
+        <w:t>.</w:t>
+      </w:r>
+    </w:p>
+    <w:p>
+      <w:r>
+        <w:t xml:space="preserve">material </w:t>
+      </w:r>
+      <w:r>
+        <w:t>shortage</w:t>
+      </w:r>
+      <w:r>
+        <w:t xml:space="preserve"> </w:t>
+      </w:r>
+      <w:r>
+        <w:t>issue.</w:t>
       </w:r>
     </w:p>
     <w:p/>
@@ -490,6 +746,127 @@
     </w:sectPr>
   </w:body>
 </w:document>
+</file>
+
+<file path=word/numbering.xml><?xml version="1.0" encoding="utf-8"?>
+<w:numbering xmlns:wpc="http://schemas.microsoft.com/office/word/2010/wordprocessingCanvas" xmlns:cx="http://schemas.microsoft.com/office/drawing/2014/chartex" xmlns:cx1="http://schemas.microsoft.com/office/drawing/2015/9/8/chartex" xmlns:cx2="http://schemas.microsoft.com/office/drawing/2015/10/21/chartex" xmlns:cx3="http://schemas.microsoft.com/office/drawing/2016/5/9/chartex" xmlns:cx4="http://schemas.microsoft.com/office/drawing/2016/5/10/chartex" xmlns:cx5="http://schemas.microsoft.com/office/drawing/2016/5/11/chartex" xmlns:cx6="http://schemas.microsoft.com/office/drawing/2016/5/12/chartex" xmlns:cx7="http://schemas.microsoft.com/office/drawing/2016/5/13/chartex" xmlns:cx8="http://schemas.microsoft.com/office/drawing/2016/5/14/chartex" xmlns:mc="http://schemas.openxmlformats.org/markup-compatibility/2006" xmlns:aink="http://schemas.microsoft.com/office/drawing/2016/ink" xmlns:am3d="http://schemas.microsoft.com/office/drawing/2017/model3d" xmlns:o="urn:schemas-microsoft-com:office:office" xmlns:oel="http://schemas.microsoft.com/office/2019/extlst" xmlns:r="http://schemas.openxmlformats.org/officeDocument/2006/relationships" xmlns:m="http://schemas.openxmlformats.org/officeDocument/2006/math" xmlns:v="urn:schemas-microsoft-com:vml" xmlns:wp14="http://schemas.microsoft.com/office/word/2010/wordprocessingDrawing" xmlns:wp="http://schemas.openxmlformats.org/drawingml/2006/wordprocessingDrawing" xmlns:w10="urn:schemas-microsoft-com:office:word" xmlns:w="http://schemas.openxmlformats.org/wordprocessingml/2006/main" xmlns:w14="http://schemas.microsoft.com/office/word/2010/wordml" xmlns:w15="http://schemas.microsoft.com/office/word/2012/wordml" xmlns:w16cex="http://schemas.microsoft.com/office/word/2018/wordml/cex" xmlns:w16cid="http://schemas.microsoft.com/office/word/2016/wordml/cid" xmlns:w16="http://schemas.microsoft.com/office/word/2018/wordml" xmlns:w16du="http://schemas.microsoft.com/office/word/2023/wordml/word16du" xmlns:w16sdtdh="http://schemas.microsoft.com/office/word/2020/wordml/sdtdatahash" xmlns:w16sdtfl="http://schemas.microsoft.com/office/word/2024/wordml/sdtformatlock" xmlns:w16se="http://schemas.microsoft.com/office/word/2015/wordml/symex" xmlns:wpg="http://schemas.microsoft.com/office/word/2010/wordprocessingGroup" xmlns:wpi="http://schemas.microsoft.com/office/word/2010/wordprocessingInk" xmlns:wne="http://schemas.microsoft.com/office/word/2006/wordml" xmlns:wps="http://schemas.microsoft.com/office/word/2010/wordprocessingShape" mc:Ignorable="w14 w15 w16se w16cid w16 w16cex w16sdtdh w16sdtfl w16du wp14">
+  <w:abstractNum w:abstractNumId="0" w15:restartNumberingAfterBreak="0">
+    <w:nsid w:val="296D7E95"/>
+    <w:multiLevelType w:val="hybridMultilevel"/>
+    <w:tmpl w:val="AE9C1A44"/>
+    <w:lvl w:ilvl="0" w:tplc="D5E2D2BA">
+      <w:start w:val="6400"/>
+      <w:numFmt w:val="bullet"/>
+      <w:lvlText w:val="-"/>
+      <w:lvlJc w:val="left"/>
+      <w:pPr>
+        <w:ind w:left="720" w:hanging="360"/>
+      </w:pPr>
+      <w:rPr>
+        <w:rFonts w:ascii="Aptos" w:eastAsiaTheme="minorHAnsi" w:hAnsi="Aptos" w:cstheme="minorBidi" w:hint="default"/>
+      </w:rPr>
+    </w:lvl>
+    <w:lvl w:ilvl="1" w:tplc="08090003" w:tentative="1">
+      <w:start w:val="1"/>
+      <w:numFmt w:val="bullet"/>
+      <w:lvlText w:val="o"/>
+      <w:lvlJc w:val="left"/>
+      <w:pPr>
+        <w:ind w:left="1440" w:hanging="360"/>
+      </w:pPr>
+      <w:rPr>
+        <w:rFonts w:ascii="Courier New" w:hAnsi="Courier New" w:cs="Courier New" w:hint="default"/>
+      </w:rPr>
+    </w:lvl>
+    <w:lvl w:ilvl="2" w:tplc="08090005" w:tentative="1">
+      <w:start w:val="1"/>
+      <w:numFmt w:val="bullet"/>
+      <w:lvlText w:val=""/>
+      <w:lvlJc w:val="left"/>
+      <w:pPr>
+        <w:ind w:left="2160" w:hanging="360"/>
+      </w:pPr>
+      <w:rPr>
+        <w:rFonts w:ascii="Wingdings" w:hAnsi="Wingdings" w:hint="default"/>
+      </w:rPr>
+    </w:lvl>
+    <w:lvl w:ilvl="3" w:tplc="08090001" w:tentative="1">
+      <w:start w:val="1"/>
+      <w:numFmt w:val="bullet"/>
+      <w:lvlText w:val=""/>
+      <w:lvlJc w:val="left"/>
+      <w:pPr>
+        <w:ind w:left="2880" w:hanging="360"/>
+      </w:pPr>
+      <w:rPr>
+        <w:rFonts w:ascii="Symbol" w:hAnsi="Symbol" w:hint="default"/>
+      </w:rPr>
+    </w:lvl>
+    <w:lvl w:ilvl="4" w:tplc="08090003" w:tentative="1">
+      <w:start w:val="1"/>
+      <w:numFmt w:val="bullet"/>
+      <w:lvlText w:val="o"/>
+      <w:lvlJc w:val="left"/>
+      <w:pPr>
+        <w:ind w:left="3600" w:hanging="360"/>
+      </w:pPr>
+      <w:rPr>
+        <w:rFonts w:ascii="Courier New" w:hAnsi="Courier New" w:cs="Courier New" w:hint="default"/>
+      </w:rPr>
+    </w:lvl>
+    <w:lvl w:ilvl="5" w:tplc="08090005" w:tentative="1">
+      <w:start w:val="1"/>
+      <w:numFmt w:val="bullet"/>
+      <w:lvlText w:val=""/>
+      <w:lvlJc w:val="left"/>
+      <w:pPr>
+        <w:ind w:left="4320" w:hanging="360"/>
+      </w:pPr>
+      <w:rPr>
+        <w:rFonts w:ascii="Wingdings" w:hAnsi="Wingdings" w:hint="default"/>
+      </w:rPr>
+    </w:lvl>
+    <w:lvl w:ilvl="6" w:tplc="08090001" w:tentative="1">
+      <w:start w:val="1"/>
+      <w:numFmt w:val="bullet"/>
+      <w:lvlText w:val=""/>
+      <w:lvlJc w:val="left"/>
+      <w:pPr>
+        <w:ind w:left="5040" w:hanging="360"/>
+      </w:pPr>
+      <w:rPr>
+        <w:rFonts w:ascii="Symbol" w:hAnsi="Symbol" w:hint="default"/>
+      </w:rPr>
+    </w:lvl>
+    <w:lvl w:ilvl="7" w:tplc="08090003" w:tentative="1">
+      <w:start w:val="1"/>
+      <w:numFmt w:val="bullet"/>
+      <w:lvlText w:val="o"/>
+      <w:lvlJc w:val="left"/>
+      <w:pPr>
+        <w:ind w:left="5760" w:hanging="360"/>
+      </w:pPr>
+      <w:rPr>
+        <w:rFonts w:ascii="Courier New" w:hAnsi="Courier New" w:cs="Courier New" w:hint="default"/>
+      </w:rPr>
+    </w:lvl>
+    <w:lvl w:ilvl="8" w:tplc="08090005" w:tentative="1">
+      <w:start w:val="1"/>
+      <w:numFmt w:val="bullet"/>
+      <w:lvlText w:val=""/>
+      <w:lvlJc w:val="left"/>
+      <w:pPr>
+        <w:ind w:left="6480" w:hanging="360"/>
+      </w:pPr>
+      <w:rPr>
+        <w:rFonts w:ascii="Wingdings" w:hAnsi="Wingdings" w:hint="default"/>
+      </w:rPr>
+    </w:lvl>
+  </w:abstractNum>
+  <w:num w:numId="1" w16cid:durableId="240720809">
+    <w:abstractNumId w:val="0"/>
+  </w:num>
+</w:numbering>
 </file>
 
 <file path=word/styles.xml><?xml version="1.0" encoding="utf-8"?>
@@ -1095,6 +1472,7 @@
   <w:style w:type="character" w:default="1" w:styleId="DefaultParagraphFont">
     <w:name w:val="Default Paragraph Font"/>
     <w:uiPriority w:val="1"/>
+    <w:semiHidden/>
     <w:unhideWhenUsed/>
   </w:style>
   <w:style w:type="table" w:default="1" w:styleId="TableNormal">

</xml_diff>